<commit_message>
feat(frontend): agregar Tarea 14 - Panel de Moderador al Backlog
</commit_message>
<xml_diff>
--- a/docs/BACKLOG_DE_TAREAS_POR_EQUIPO.docx
+++ b/docs/BACKLOG_DE_TAREAS_POR_EQUIPO.docx
@@ -3791,6 +3791,133 @@
           </w:p>
         </w:tc>
       </w:tr>
+      <w:tr>
+        <w:tc>
+          <w:tcPr>
+            <w:tcW w:type="dxa" w:w="450"/>
+            <w:tcMar>
+              <w:top w:type="dxa" w:w="90"/>
+              <w:left w:type="dxa" w:w="110"/>
+              <w:bottom w:type="dxa" w:w="90"/>
+              <w:right w:type="dxa" w:w="110"/>
+            </w:tcMar>
+            <w:vAlign w:val="center"/>
+          </w:tcPr>
+          <w:p>
+            <w:r>
+              <w:rPr>
+                <w:rFonts w:ascii="Calibri" w:cs="Calibri" w:eastAsia="Calibri" w:hAnsi="Calibri"/>
+                <w:b w:val="false"/>
+                <w:bCs w:val="false"/>
+                <w:color w:val="000000"/>
+                <w:sz w:val="19"/>
+                <w:szCs w:val="19"/>
+              </w:rPr>
+              <w:t xml:space="preserve">14</w:t>
+            </w:r>
+          </w:p>
+        </w:tc>
+        <w:tc>
+          <w:tcPr>
+            <w:tcW w:type="dxa" w:w="4300"/>
+            <w:tcMar>
+              <w:top w:type="dxa" w:w="90"/>
+              <w:left w:type="dxa" w:w="110"/>
+              <w:bottom w:type="dxa" w:w="90"/>
+              <w:right w:type="dxa" w:w="110"/>
+            </w:tcMar>
+            <w:vAlign w:val="center"/>
+          </w:tcPr>
+          <w:p>
+            <w:r>
+              <w:rPr>
+                <w:rFonts w:ascii="Calibri" w:cs="Calibri" w:eastAsia="Calibri" w:hAnsi="Calibri"/>
+                <w:b w:val="false"/>
+                <w:bCs w:val="false"/>
+                <w:color w:val="000000"/>
+                <w:sz w:val="19"/>
+                <w:szCs w:val="19"/>
+              </w:rPr>
+              <w:t xml:space="preserve">Panel de Moderador (pantalla única, NO mobile-first): botones Crear Sala, Iniciar Partida, Siguiente Pregunta y Activar Ruleta.</w:t>
+            </w:r>
+          </w:p>
+        </w:tc>
+        <w:tc>
+          <w:tcPr>
+            <w:tcW w:type="dxa" w:w="1500"/>
+            <w:tcMar>
+              <w:top w:type="dxa" w:w="90"/>
+              <w:left w:type="dxa" w:w="110"/>
+              <w:bottom w:type="dxa" w:w="90"/>
+              <w:right w:type="dxa" w:w="110"/>
+            </w:tcMar>
+            <w:vAlign w:val="center"/>
+          </w:tcPr>
+          <w:p>
+            <w:r>
+              <w:rPr>
+                <w:rFonts w:ascii="Calibri" w:cs="Calibri" w:eastAsia="Calibri" w:hAnsi="Calibri"/>
+                <w:b w:val="false"/>
+                <w:bCs w:val="false"/>
+                <w:color w:val="000000"/>
+                <w:sz w:val="19"/>
+                <w:szCs w:val="19"/>
+              </w:rPr>
+              <w:t xml:space="preserve">Backend 3, 7, 8, 10</w:t>
+            </w:r>
+          </w:p>
+        </w:tc>
+        <w:tc>
+          <w:tcPr>
+            <w:tcW w:type="dxa" w:w="1200"/>
+            <w:tcMar>
+              <w:top w:type="dxa" w:w="90"/>
+              <w:left w:type="dxa" w:w="110"/>
+              <w:bottom w:type="dxa" w:w="90"/>
+              <w:right w:type="dxa" w:w="110"/>
+            </w:tcMar>
+            <w:vAlign w:val="center"/>
+          </w:tcPr>
+          <w:p>
+            <w:r>
+              <w:rPr>
+                <w:rFonts w:ascii="Calibri" w:cs="Calibri" w:eastAsia="Calibri" w:hAnsi="Calibri"/>
+                <w:b w:val="false"/>
+                <w:bCs w:val="false"/>
+                <w:color w:val="000000"/>
+                <w:sz w:val="19"/>
+                <w:szCs w:val="19"/>
+              </w:rPr>
+              <w:t xml:space="preserve">S3</w:t>
+            </w:r>
+          </w:p>
+        </w:tc>
+        <w:tc>
+          <w:tcPr>
+            <w:tcW w:type="dxa" w:w="1900"/>
+            <w:tcMar>
+              <w:top w:type="dxa" w:w="90"/>
+              <w:left w:type="dxa" w:w="110"/>
+              <w:bottom w:type="dxa" w:w="90"/>
+              <w:right w:type="dxa" w:w="110"/>
+            </w:tcMar>
+            <w:vAlign w:val="center"/>
+          </w:tcPr>
+          <w:p>
+            <w:r>
+              <w:rPr>
+                <w:rFonts w:ascii="Calibri" w:cs="Calibri" w:eastAsia="Calibri" w:hAnsi="Calibri"/>
+                <w:b w:val="false"/>
+                <w:bCs w:val="false"/>
+                <w:color w:val="000000"/>
+                <w:sz w:val="19"/>
+                <w:szCs w:val="19"/>
+              </w:rPr>
+              <w:t xml:space="preserve">RF-01, CU-03, RF-11 (Bitácora #6)</w:t>
+            </w:r>
+          </w:p>
+        </w:tc>
+      </w:tr>
     </w:tbl>
     <w:p>
       <w:pPr>
@@ -7266,6 +7393,24 @@
           <w:szCs w:val="22"/>
         </w:rPr>
         <w:t xml:space="preserve">El Hito H2 (Core de Comunicación Estable, fin de semana 3) es el punto en el que Backend debe tener listas las tareas 1 a 11 — es la señal para que Frontend acelere su integración final.</w:t>
+      </w:r>
+    </w:p>
+    <w:p>
+      <w:pPr>
+        <w:pStyle w:val="ListParagraph"/>
+        <w:numPr>
+          <w:ilvl w:val="0"/>
+          <w:numId w:val="2"/>
+        </w:numPr>
+        <w:spacing w:after="80"/>
+      </w:pPr>
+      <w:r>
+        <w:rPr>
+          <w:rFonts w:ascii="Calibri" w:cs="Calibri" w:eastAsia="Calibri" w:hAnsi="Calibri"/>
+          <w:sz w:val="22"/>
+          <w:szCs w:val="22"/>
+        </w:rPr>
+        <w:t xml:space="preserve">Frontend (tarea 14, Panel de Moderador) puede empezar en paralelo con las tareas 5-8 — no depende de ellas, solo de Backend (tareas 3, 7, 8 y 10). Es la tarea que resuelve la Bitácora de Decisiones Técnicas #6: sin ella, nadie puede operar la partida el día del evento.</w:t>
       </w:r>
     </w:p>
     <w:sectPr>

</xml_diff>

<commit_message>
Add frontend game experience and project docs
Co-authored-by: Copilot <223556219+Copilot@users.noreply.github.com>
</commit_message>
<xml_diff>
--- a/docs/BACKLOG_DE_TAREAS_POR_EQUIPO.docx
+++ b/docs/BACKLOG_DE_TAREAS_POR_EQUIPO.docx
@@ -1,6 +1,6 @@
 
 <file path=word/document.xml><?xml version="1.0" encoding="utf-8"?>
-<w:document xmlns:wpc="http://schemas.microsoft.com/office/word/2010/wordprocessingCanvas" xmlns:cx="http://schemas.microsoft.com/office/drawing/2014/chartex" xmlns:cx1="http://schemas.microsoft.com/office/drawing/2015/9/8/chartex" xmlns:cx2="http://schemas.microsoft.com/office/drawing/2015/10/21/chartex" xmlns:cx3="http://schemas.microsoft.com/office/drawing/2016/5/9/chartex" xmlns:cx4="http://schemas.microsoft.com/office/drawing/2016/5/10/chartex" xmlns:cx5="http://schemas.microsoft.com/office/drawing/2016/5/11/chartex" xmlns:cx6="http://schemas.microsoft.com/office/drawing/2016/5/12/chartex" xmlns:cx7="http://schemas.microsoft.com/office/drawing/2016/5/13/chartex" xmlns:cx8="http://schemas.microsoft.com/office/drawing/2016/5/14/chartex" xmlns:mc="http://schemas.openxmlformats.org/markup-compatibility/2006" xmlns:m="http://schemas.openxmlformats.org/officeDocument/2006/math" xmlns:aink="http://schemas.microsoft.com/office/drawing/2016/ink" xmlns:am3d="http://schemas.microsoft.com/office/drawing/2017/model3d" xmlns:oel="http://schemas.microsoft.com/office/2019/extlst" xmlns:r="http://schemas.openxmlformats.org/officeDocument/2006/relationships" xmlns:wp14="http://schemas.microsoft.com/office/word/2010/wordprocessingDrawing" xmlns:wp="http://schemas.openxmlformats.org/drawingml/2006/wordprocessingDrawing" xmlns:wpg="http://schemas.microsoft.com/office/word/2010/wordprocessingGroup" xmlns:wpi="http://schemas.microsoft.com/office/word/2010/wordprocessingInk" xmlns:wps="http://schemas.microsoft.com/office/word/2010/wordprocessingShape" xmlns:o="urn:schemas-microsoft-com:office:office" xmlns:v="urn:schemas-microsoft-com:vml" xmlns:w10="urn:schemas-microsoft-com:office:word" xmlns:w="http://schemas.openxmlformats.org/wordprocessingml/2006/main" xmlns:w14="http://schemas.microsoft.com/office/word/2010/wordml" xmlns:w15="http://schemas.microsoft.com/office/word/2012/wordml" xmlns:w16cex="http://schemas.microsoft.com/office/word/2018/wordml/cex" xmlns:w16cid="http://schemas.microsoft.com/office/word/2016/wordml/cid" xmlns:w16="http://schemas.microsoft.com/office/word/2018/wordml" xmlns:w16sdtdh="http://schemas.microsoft.com/office/word/2020/wordml/sdtdatahash" xmlns:w16sdtfl="http://schemas.microsoft.com/office/word/2024/wordml/sdtformatlock" xmlns:w16se="http://schemas.microsoft.com/office/word/2015/wordml/symex" xmlns:w16du="http://schemas.microsoft.com/office/word/2023/wordml/word16du" xmlns:wne="http://schemas.microsoft.com/office/word/2006/wordml" mc:Ignorable="w14 w15 w16se w16cid w16 w16cex w16sdtdh w16sdtfl w16du wp14">
+<w:document xmlns:wpc="http://schemas.microsoft.com/office/word/2010/wordprocessingCanvas" xmlns:cx="http://schemas.microsoft.com/office/drawing/2014/chartex" xmlns:cx1="http://schemas.microsoft.com/office/drawing/2015/9/8/chartex" xmlns:cx2="http://schemas.microsoft.com/office/drawing/2015/10/21/chartex" xmlns:cx3="http://schemas.microsoft.com/office/drawing/2016/5/9/chartex" xmlns:cx4="http://schemas.microsoft.com/office/drawing/2016/5/10/chartex" xmlns:cx5="http://schemas.microsoft.com/office/drawing/2016/5/11/chartex" xmlns:cx6="http://schemas.microsoft.com/office/drawing/2016/5/12/chartex" xmlns:cx7="http://schemas.microsoft.com/office/drawing/2016/5/13/chartex" xmlns:cx8="http://schemas.microsoft.com/office/drawing/2016/5/14/chartex" xmlns:mc="http://schemas.openxmlformats.org/markup-compatibility/2006" xmlns:aink="http://schemas.microsoft.com/office/drawing/2016/ink" xmlns:am3d="http://schemas.microsoft.com/office/drawing/2017/model3d" xmlns:o="urn:schemas-microsoft-com:office:office" xmlns:r="http://schemas.openxmlformats.org/officeDocument/2006/relationships" xmlns:m="http://schemas.openxmlformats.org/officeDocument/2006/math" xmlns:v="urn:schemas-microsoft-com:vml" xmlns:wp14="http://schemas.microsoft.com/office/word/2010/wordprocessingDrawing" xmlns:wp="http://schemas.openxmlformats.org/drawingml/2006/wordprocessingDrawing" xmlns:w10="urn:schemas-microsoft-com:office:word" xmlns:w="http://schemas.openxmlformats.org/wordprocessingml/2006/main" xmlns:w14="http://schemas.microsoft.com/office/word/2010/wordml" xmlns:w15="http://schemas.microsoft.com/office/word/2012/wordml" xmlns:w16cex="http://schemas.microsoft.com/office/word/2018/wordml/cex" xmlns:w16cid="http://schemas.microsoft.com/office/word/2016/wordml/cid" xmlns:w16="http://schemas.microsoft.com/office/word/2018/wordml" xmlns:w16sdtdh="http://schemas.microsoft.com/office/word/2020/wordml/sdtdatahash" xmlns:w16se="http://schemas.microsoft.com/office/word/2015/wordml/symex" xmlns:wpg="http://schemas.microsoft.com/office/word/2010/wordprocessingGroup" xmlns:wpi="http://schemas.microsoft.com/office/word/2010/wordprocessingInk" xmlns:wne="http://schemas.microsoft.com/office/word/2006/wordml" xmlns:wps="http://schemas.microsoft.com/office/word/2010/wordprocessingShape" mc:Ignorable="w14 w15 w16se w16cid w16 w16cex w16sdtdh wp14">
   <w:body>
     <w:p>
       <w:pPr>
@@ -100,7 +100,29 @@
           <w:sz w:val="21"/>
           <w:szCs w:val="21"/>
         </w:rPr>
-        <w:t xml:space="preserve">⚠ Adjunten este documento junto con el Contrato de Integración en CADA conversación con la IA. Al iniciar, agreguen al </w:t>
+        <w:t>⚠</w:t>
+      </w:r>
+      <w:r>
+        <w:rPr>
+          <w:rFonts w:ascii="Calibri" w:eastAsia="Calibri" w:hAnsi="Calibri" w:cs="Calibri"/>
+          <w:i/>
+          <w:iCs/>
+          <w:color w:val="594100"/>
+          <w:sz w:val="21"/>
+          <w:szCs w:val="21"/>
+        </w:rPr>
+        <w:t xml:space="preserve"> Adjunten este documento junto con el Contrato de Integr</w:t>
+      </w:r>
+      <w:r>
+        <w:rPr>
+          <w:rFonts w:ascii="Calibri" w:eastAsia="Calibri" w:hAnsi="Calibri" w:cs="Calibri"/>
+          <w:i/>
+          <w:iCs/>
+          <w:color w:val="594100"/>
+          <w:sz w:val="21"/>
+          <w:szCs w:val="21"/>
+        </w:rPr>
+        <w:t xml:space="preserve">ación en CADA conversación con la IA. Al iniciar, agreguen al </w:t>
       </w:r>
       <w:proofErr w:type="spellStart"/>
       <w:r>
@@ -124,7 +146,18 @@
           <w:sz w:val="21"/>
           <w:szCs w:val="21"/>
         </w:rPr>
-        <w:t xml:space="preserve"> maestro: «Estamos en la tarea N del Backlog de [su equipo]. No avances a la tarea N+1 hasta que yo confirme que terminé y probé la actual.» Así, aunque abran una conversación nueva sin memoria de la anterior, la IA retoma exactamente </w:t>
+        <w:t xml:space="preserve"> maestro: «Estamos en la tarea N del Backlog de [su equipo]. No avances a la tarea N+1 hasta que yo confirme que terminé y probé la actual.» Así, aunque abran una conversación nueva sin me</w:t>
+      </w:r>
+      <w:r>
+        <w:rPr>
+          <w:rFonts w:ascii="Calibri" w:eastAsia="Calibri" w:hAnsi="Calibri" w:cs="Calibri"/>
+          <w:i/>
+          <w:iCs/>
+          <w:color w:val="594100"/>
+          <w:sz w:val="21"/>
+          <w:szCs w:val="21"/>
+        </w:rPr>
+        <w:t xml:space="preserve">moria de la anterior, la IA retoma exactamente </w:t>
       </w:r>
       <w:proofErr w:type="spellStart"/>
       <w:r>
@@ -184,7 +217,15 @@
           <w:sz w:val="22"/>
           <w:szCs w:val="22"/>
         </w:rPr>
-        <w:t>La columna «Semana» es una referencia aproximada según el Cronograma (S1 a S5) — no es una fecha fija, es una guía de ritmo.</w:t>
+        <w:t xml:space="preserve">La columna «Semana» es una referencia aproximada según el Cronograma (S1 a S5) — no es una </w:t>
+      </w:r>
+      <w:r>
+        <w:rPr>
+          <w:rFonts w:ascii="Calibri" w:eastAsia="Calibri" w:hAnsi="Calibri" w:cs="Calibri"/>
+          <w:sz w:val="22"/>
+          <w:szCs w:val="22"/>
+        </w:rPr>
+        <w:t>fecha fija, es una guía de ritmo.</w:t>
       </w:r>
     </w:p>
     <w:p>
@@ -268,12 +309,6 @@
         <w:gridCol w:w="1900"/>
       </w:tblGrid>
       <w:tr>
-        <w:tblPrEx>
-          <w:tblCellMar>
-            <w:top w:w="0" w:type="dxa"/>
-            <w:bottom w:w="0" w:type="dxa"/>
-          </w:tblCellMar>
-        </w:tblPrEx>
         <w:trPr>
           <w:tblHeader/>
         </w:trPr>
@@ -403,18 +438,23 @@
                 <w:sz w:val="19"/>
                 <w:szCs w:val="19"/>
               </w:rPr>
-              <w:t>Referencia</w:t>
+              <w:t>Referenci</w:t>
+            </w:r>
+            <w:r>
+              <w:rPr>
+                <w:rFonts w:ascii="Calibri" w:eastAsia="Calibri" w:hAnsi="Calibri" w:cs="Calibri"/>
+                <w:b/>
+                <w:bCs/>
+                <w:color w:val="FFFFFF"/>
+                <w:sz w:val="19"/>
+                <w:szCs w:val="19"/>
+              </w:rPr>
+              <w:t>a</w:t>
             </w:r>
           </w:p>
         </w:tc>
       </w:tr>
       <w:tr>
-        <w:tblPrEx>
-          <w:tblCellMar>
-            <w:top w:w="0" w:type="dxa"/>
-            <w:bottom w:w="0" w:type="dxa"/>
-          </w:tblCellMar>
-        </w:tblPrEx>
         <w:tc>
           <w:tcPr>
             <w:tcW w:w="450" w:type="dxa"/>
@@ -457,7 +497,27 @@
                 <w:sz w:val="19"/>
                 <w:szCs w:val="19"/>
               </w:rPr>
-              <w:t xml:space="preserve">Configurar proyecto Spring Boot (Web, </w:t>
+              <w:t xml:space="preserve">Configurar proyecto Spring </w:t>
+            </w:r>
+            <w:proofErr w:type="spellStart"/>
+            <w:r>
+              <w:rPr>
+                <w:rFonts w:ascii="Calibri" w:eastAsia="Calibri" w:hAnsi="Calibri" w:cs="Calibri"/>
+                <w:color w:val="000000"/>
+                <w:sz w:val="19"/>
+                <w:szCs w:val="19"/>
+              </w:rPr>
+              <w:t>Boot</w:t>
+            </w:r>
+            <w:proofErr w:type="spellEnd"/>
+            <w:r>
+              <w:rPr>
+                <w:rFonts w:ascii="Calibri" w:eastAsia="Calibri" w:hAnsi="Calibri" w:cs="Calibri"/>
+                <w:color w:val="000000"/>
+                <w:sz w:val="19"/>
+                <w:szCs w:val="19"/>
+              </w:rPr>
+              <w:t xml:space="preserve"> (Web, </w:t>
             </w:r>
             <w:proofErr w:type="spellStart"/>
             <w:r>
@@ -552,12 +612,6 @@
         </w:tc>
       </w:tr>
       <w:tr>
-        <w:tblPrEx>
-          <w:tblCellMar>
-            <w:top w:w="0" w:type="dxa"/>
-            <w:bottom w:w="0" w:type="dxa"/>
-          </w:tblCellMar>
-        </w:tblPrEx>
         <w:tc>
           <w:tcPr>
             <w:tcW w:w="450" w:type="dxa"/>
@@ -600,7 +654,27 @@
                 <w:sz w:val="19"/>
                 <w:szCs w:val="19"/>
               </w:rPr>
-              <w:t xml:space="preserve">Crear entidades JPA Room, Player, </w:t>
+              <w:t xml:space="preserve">Crear entidades JPA </w:t>
+            </w:r>
+            <w:proofErr w:type="spellStart"/>
+            <w:r>
+              <w:rPr>
+                <w:rFonts w:ascii="Calibri" w:eastAsia="Calibri" w:hAnsi="Calibri" w:cs="Calibri"/>
+                <w:color w:val="000000"/>
+                <w:sz w:val="19"/>
+                <w:szCs w:val="19"/>
+              </w:rPr>
+              <w:t>Room</w:t>
+            </w:r>
+            <w:proofErr w:type="spellEnd"/>
+            <w:r>
+              <w:rPr>
+                <w:rFonts w:ascii="Calibri" w:eastAsia="Calibri" w:hAnsi="Calibri" w:cs="Calibri"/>
+                <w:color w:val="000000"/>
+                <w:sz w:val="19"/>
+                <w:szCs w:val="19"/>
+              </w:rPr>
+              <w:t xml:space="preserve">, Player, </w:t>
             </w:r>
             <w:proofErr w:type="spellStart"/>
             <w:r>
@@ -715,12 +789,6 @@
         </w:tc>
       </w:tr>
       <w:tr>
-        <w:tblPrEx>
-          <w:tblCellMar>
-            <w:top w:w="0" w:type="dxa"/>
-            <w:bottom w:w="0" w:type="dxa"/>
-          </w:tblCellMar>
-        </w:tblPrEx>
         <w:tc>
           <w:tcPr>
             <w:tcW w:w="450" w:type="dxa"/>
@@ -869,12 +937,6 @@
         </w:tc>
       </w:tr>
       <w:tr>
-        <w:tblPrEx>
-          <w:tblCellMar>
-            <w:top w:w="0" w:type="dxa"/>
-            <w:bottom w:w="0" w:type="dxa"/>
-          </w:tblCellMar>
-        </w:tblPrEx>
         <w:tc>
           <w:tcPr>
             <w:tcW w:w="450" w:type="dxa"/>
@@ -1020,12 +1082,6 @@
         </w:tc>
       </w:tr>
       <w:tr>
-        <w:tblPrEx>
-          <w:tblCellMar>
-            <w:top w:w="0" w:type="dxa"/>
-            <w:bottom w:w="0" w:type="dxa"/>
-          </w:tblCellMar>
-        </w:tblPrEx>
         <w:tc>
           <w:tcPr>
             <w:tcW w:w="450" w:type="dxa"/>
@@ -1171,12 +1227,6 @@
         </w:tc>
       </w:tr>
       <w:tr>
-        <w:tblPrEx>
-          <w:tblCellMar>
-            <w:top w:w="0" w:type="dxa"/>
-            <w:bottom w:w="0" w:type="dxa"/>
-          </w:tblCellMar>
-        </w:tblPrEx>
         <w:tc>
           <w:tcPr>
             <w:tcW w:w="450" w:type="dxa"/>
@@ -1212,14 +1262,25 @@
             <w:vAlign w:val="center"/>
           </w:tcPr>
           <w:p>
-            <w:r>
-              <w:rPr>
-                <w:rFonts w:ascii="Calibri" w:eastAsia="Calibri" w:hAnsi="Calibri" w:cs="Calibri"/>
-                <w:color w:val="000000"/>
-                <w:sz w:val="19"/>
-                <w:szCs w:val="19"/>
-              </w:rPr>
-              <w:t>Topic /</w:t>
+            <w:proofErr w:type="spellStart"/>
+            <w:r>
+              <w:rPr>
+                <w:rFonts w:ascii="Calibri" w:eastAsia="Calibri" w:hAnsi="Calibri" w:cs="Calibri"/>
+                <w:color w:val="000000"/>
+                <w:sz w:val="19"/>
+                <w:szCs w:val="19"/>
+              </w:rPr>
+              <w:t>Topic</w:t>
+            </w:r>
+            <w:proofErr w:type="spellEnd"/>
+            <w:r>
+              <w:rPr>
+                <w:rFonts w:ascii="Calibri" w:eastAsia="Calibri" w:hAnsi="Calibri" w:cs="Calibri"/>
+                <w:color w:val="000000"/>
+                <w:sz w:val="19"/>
+                <w:szCs w:val="19"/>
+              </w:rPr>
+              <w:t xml:space="preserve"> /</w:t>
             </w:r>
             <w:proofErr w:type="spellStart"/>
             <w:r>
@@ -1354,12 +1415,6 @@
         </w:tc>
       </w:tr>
       <w:tr>
-        <w:tblPrEx>
-          <w:tblCellMar>
-            <w:top w:w="0" w:type="dxa"/>
-            <w:bottom w:w="0" w:type="dxa"/>
-          </w:tblCellMar>
-        </w:tblPrEx>
         <w:tc>
           <w:tcPr>
             <w:tcW w:w="450" w:type="dxa"/>
@@ -1597,12 +1652,6 @@
         </w:tc>
       </w:tr>
       <w:tr>
-        <w:tblPrEx>
-          <w:tblCellMar>
-            <w:top w:w="0" w:type="dxa"/>
-            <w:bottom w:w="0" w:type="dxa"/>
-          </w:tblCellMar>
-        </w:tblPrEx>
         <w:tc>
           <w:tcPr>
             <w:tcW w:w="450" w:type="dxa"/>
@@ -1780,12 +1829,6 @@
         </w:tc>
       </w:tr>
       <w:tr>
-        <w:tblPrEx>
-          <w:tblCellMar>
-            <w:top w:w="0" w:type="dxa"/>
-            <w:bottom w:w="0" w:type="dxa"/>
-          </w:tblCellMar>
-        </w:tblPrEx>
         <w:tc>
           <w:tcPr>
             <w:tcW w:w="450" w:type="dxa"/>
@@ -1963,12 +2006,6 @@
         </w:tc>
       </w:tr>
       <w:tr>
-        <w:tblPrEx>
-          <w:tblCellMar>
-            <w:top w:w="0" w:type="dxa"/>
-            <w:bottom w:w="0" w:type="dxa"/>
-          </w:tblCellMar>
-        </w:tblPrEx>
         <w:tc>
           <w:tcPr>
             <w:tcW w:w="450" w:type="dxa"/>
@@ -2137,12 +2174,6 @@
         </w:tc>
       </w:tr>
       <w:tr>
-        <w:tblPrEx>
-          <w:tblCellMar>
-            <w:top w:w="0" w:type="dxa"/>
-            <w:bottom w:w="0" w:type="dxa"/>
-          </w:tblCellMar>
-        </w:tblPrEx>
         <w:tc>
           <w:tcPr>
             <w:tcW w:w="450" w:type="dxa"/>
@@ -2310,12 +2341,6 @@
         </w:tc>
       </w:tr>
       <w:tr>
-        <w:tblPrEx>
-          <w:tblCellMar>
-            <w:top w:w="0" w:type="dxa"/>
-            <w:bottom w:w="0" w:type="dxa"/>
-          </w:tblCellMar>
-        </w:tblPrEx>
         <w:tc>
           <w:tcPr>
             <w:tcW w:w="450" w:type="dxa"/>
@@ -2473,12 +2498,6 @@
         </w:tc>
       </w:tr>
       <w:tr>
-        <w:tblPrEx>
-          <w:tblCellMar>
-            <w:top w:w="0" w:type="dxa"/>
-            <w:bottom w:w="0" w:type="dxa"/>
-          </w:tblCellMar>
-        </w:tblPrEx>
         <w:tc>
           <w:tcPr>
             <w:tcW w:w="450" w:type="dxa"/>
@@ -2665,12 +2684,6 @@
         <w:gridCol w:w="1900"/>
       </w:tblGrid>
       <w:tr>
-        <w:tblPrEx>
-          <w:tblCellMar>
-            <w:top w:w="0" w:type="dxa"/>
-            <w:bottom w:w="0" w:type="dxa"/>
-          </w:tblCellMar>
-        </w:tblPrEx>
         <w:trPr>
           <w:tblHeader/>
         </w:trPr>
@@ -2806,12 +2819,6 @@
         </w:tc>
       </w:tr>
       <w:tr>
-        <w:tblPrEx>
-          <w:tblCellMar>
-            <w:top w:w="0" w:type="dxa"/>
-            <w:bottom w:w="0" w:type="dxa"/>
-          </w:tblCellMar>
-        </w:tblPrEx>
         <w:tc>
           <w:tcPr>
             <w:tcW w:w="450" w:type="dxa"/>
@@ -2969,12 +2976,6 @@
         </w:tc>
       </w:tr>
       <w:tr>
-        <w:tblPrEx>
-          <w:tblCellMar>
-            <w:top w:w="0" w:type="dxa"/>
-            <w:bottom w:w="0" w:type="dxa"/>
-          </w:tblCellMar>
-        </w:tblPrEx>
         <w:tc>
           <w:tcPr>
             <w:tcW w:w="450" w:type="dxa"/>
@@ -3152,12 +3153,6 @@
         </w:tc>
       </w:tr>
       <w:tr>
-        <w:tblPrEx>
-          <w:tblCellMar>
-            <w:top w:w="0" w:type="dxa"/>
-            <w:bottom w:w="0" w:type="dxa"/>
-          </w:tblCellMar>
-        </w:tblPrEx>
         <w:tc>
           <w:tcPr>
             <w:tcW w:w="450" w:type="dxa"/>
@@ -3315,12 +3310,6 @@
         </w:tc>
       </w:tr>
       <w:tr>
-        <w:tblPrEx>
-          <w:tblCellMar>
-            <w:top w:w="0" w:type="dxa"/>
-            <w:bottom w:w="0" w:type="dxa"/>
-          </w:tblCellMar>
-        </w:tblPrEx>
         <w:tc>
           <w:tcPr>
             <w:tcW w:w="450" w:type="dxa"/>
@@ -3363,7 +3352,16 @@
                 <w:sz w:val="19"/>
                 <w:szCs w:val="19"/>
               </w:rPr>
-              <w:t>Pantalla Pregunta: suscribirse a /</w:t>
+              <w:t xml:space="preserve">Pantalla </w:t>
+            </w:r>
+            <w:r>
+              <w:rPr>
+                <w:rFonts w:ascii="Calibri" w:eastAsia="Calibri" w:hAnsi="Calibri" w:cs="Calibri"/>
+                <w:color w:val="000000"/>
+                <w:sz w:val="19"/>
+                <w:szCs w:val="19"/>
+              </w:rPr>
+              <w:t>Pregunta: suscribirse a /</w:t>
             </w:r>
             <w:proofErr w:type="spellStart"/>
             <w:r>
@@ -3538,12 +3536,6 @@
         </w:tc>
       </w:tr>
       <w:tr>
-        <w:tblPrEx>
-          <w:tblCellMar>
-            <w:top w:w="0" w:type="dxa"/>
-            <w:bottom w:w="0" w:type="dxa"/>
-          </w:tblCellMar>
-        </w:tblPrEx>
         <w:tc>
           <w:tcPr>
             <w:tcW w:w="450" w:type="dxa"/>
@@ -3586,7 +3578,7 @@
                 <w:sz w:val="19"/>
                 <w:szCs w:val="19"/>
               </w:rPr>
-              <w:t>Mecánica Selección Múltiple (4 botones de color).</w:t>
+              <w:t>00</w:t>
             </w:r>
           </w:p>
         </w:tc>
@@ -3661,12 +3653,6 @@
         </w:tc>
       </w:tr>
       <w:tr>
-        <w:tblPrEx>
-          <w:tblCellMar>
-            <w:top w:w="0" w:type="dxa"/>
-            <w:bottom w:w="0" w:type="dxa"/>
-          </w:tblCellMar>
-        </w:tblPrEx>
         <w:tc>
           <w:tcPr>
             <w:tcW w:w="450" w:type="dxa"/>
@@ -3784,12 +3770,6 @@
         </w:tc>
       </w:tr>
       <w:tr>
-        <w:tblPrEx>
-          <w:tblCellMar>
-            <w:top w:w="0" w:type="dxa"/>
-            <w:bottom w:w="0" w:type="dxa"/>
-          </w:tblCellMar>
-        </w:tblPrEx>
         <w:tc>
           <w:tcPr>
             <w:tcW w:w="450" w:type="dxa"/>
@@ -3832,7 +3812,16 @@
                 <w:sz w:val="19"/>
                 <w:szCs w:val="19"/>
               </w:rPr>
-              <w:t>Mecánica Text Input (desactivar autocorrector).</w:t>
+              <w:t xml:space="preserve">Mecánica Text Input </w:t>
+            </w:r>
+            <w:r>
+              <w:rPr>
+                <w:rFonts w:ascii="Calibri" w:eastAsia="Calibri" w:hAnsi="Calibri" w:cs="Calibri"/>
+                <w:color w:val="000000"/>
+                <w:sz w:val="19"/>
+                <w:szCs w:val="19"/>
+              </w:rPr>
+              <w:t>(desactivar autocorrector).</w:t>
             </w:r>
           </w:p>
         </w:tc>
@@ -3907,12 +3896,6 @@
         </w:tc>
       </w:tr>
       <w:tr>
-        <w:tblPrEx>
-          <w:tblCellMar>
-            <w:top w:w="0" w:type="dxa"/>
-            <w:bottom w:w="0" w:type="dxa"/>
-          </w:tblCellMar>
-        </w:tblPrEx>
         <w:tc>
           <w:tcPr>
             <w:tcW w:w="450" w:type="dxa"/>
@@ -4048,12 +4031,6 @@
         </w:tc>
       </w:tr>
       <w:tr>
-        <w:tblPrEx>
-          <w:tblCellMar>
-            <w:top w:w="0" w:type="dxa"/>
-            <w:bottom w:w="0" w:type="dxa"/>
-          </w:tblCellMar>
-        </w:tblPrEx>
         <w:tc>
           <w:tcPr>
             <w:tcW w:w="450" w:type="dxa"/>
@@ -4251,12 +4228,6 @@
         </w:tc>
       </w:tr>
       <w:tr>
-        <w:tblPrEx>
-          <w:tblCellMar>
-            <w:top w:w="0" w:type="dxa"/>
-            <w:bottom w:w="0" w:type="dxa"/>
-          </w:tblCellMar>
-        </w:tblPrEx>
         <w:tc>
           <w:tcPr>
             <w:tcW w:w="450" w:type="dxa"/>
@@ -4434,12 +4405,6 @@
         </w:tc>
       </w:tr>
       <w:tr>
-        <w:tblPrEx>
-          <w:tblCellMar>
-            <w:top w:w="0" w:type="dxa"/>
-            <w:bottom w:w="0" w:type="dxa"/>
-          </w:tblCellMar>
-        </w:tblPrEx>
         <w:tc>
           <w:tcPr>
             <w:tcW w:w="450" w:type="dxa"/>
@@ -4617,12 +4582,6 @@
         </w:tc>
       </w:tr>
       <w:tr>
-        <w:tblPrEx>
-          <w:tblCellMar>
-            <w:top w:w="0" w:type="dxa"/>
-            <w:bottom w:w="0" w:type="dxa"/>
-          </w:tblCellMar>
-        </w:tblPrEx>
         <w:tc>
           <w:tcPr>
             <w:tcW w:w="450" w:type="dxa"/>
@@ -4800,12 +4759,6 @@
         </w:tc>
       </w:tr>
       <w:tr>
-        <w:tblPrEx>
-          <w:tblCellMar>
-            <w:top w:w="0" w:type="dxa"/>
-            <w:bottom w:w="0" w:type="dxa"/>
-          </w:tblCellMar>
-        </w:tblPrEx>
         <w:tc>
           <w:tcPr>
             <w:tcW w:w="450" w:type="dxa"/>
@@ -4848,7 +4801,16 @@
                 <w:sz w:val="19"/>
                 <w:szCs w:val="19"/>
               </w:rPr>
-              <w:t>Pruebas en dispositivos reales (Chrome Android / Safari iOS) con QA.</w:t>
+              <w:t xml:space="preserve">Pruebas en dispositivos reales </w:t>
+            </w:r>
+            <w:r>
+              <w:rPr>
+                <w:rFonts w:ascii="Calibri" w:eastAsia="Calibri" w:hAnsi="Calibri" w:cs="Calibri"/>
+                <w:color w:val="000000"/>
+                <w:sz w:val="19"/>
+                <w:szCs w:val="19"/>
+              </w:rPr>
+              <w:t>(Chrome Android / Safari iOS) con QA.</w:t>
             </w:r>
           </w:p>
         </w:tc>
@@ -4923,12 +4885,6 @@
         </w:tc>
       </w:tr>
       <w:tr>
-        <w:tblPrEx>
-          <w:tblCellMar>
-            <w:top w:w="0" w:type="dxa"/>
-            <w:bottom w:w="0" w:type="dxa"/>
-          </w:tblCellMar>
-        </w:tblPrEx>
         <w:tc>
           <w:tcPr>
             <w:tcW w:w="450" w:type="dxa"/>
@@ -5140,12 +5096,6 @@
         <w:gridCol w:w="1900"/>
       </w:tblGrid>
       <w:tr>
-        <w:tblPrEx>
-          <w:tblCellMar>
-            <w:top w:w="0" w:type="dxa"/>
-            <w:bottom w:w="0" w:type="dxa"/>
-          </w:tblCellMar>
-        </w:tblPrEx>
         <w:trPr>
           <w:tblHeader/>
         </w:trPr>
@@ -5281,12 +5231,6 @@
         </w:tc>
       </w:tr>
       <w:tr>
-        <w:tblPrEx>
-          <w:tblCellMar>
-            <w:top w:w="0" w:type="dxa"/>
-            <w:bottom w:w="0" w:type="dxa"/>
-          </w:tblCellMar>
-        </w:tblPrEx>
         <w:tc>
           <w:tcPr>
             <w:tcW w:w="450" w:type="dxa"/>
@@ -5360,7 +5304,27 @@
                 <w:sz w:val="19"/>
                 <w:szCs w:val="19"/>
               </w:rPr>
-              <w:t>/Stitch: las 4 vistas (PIN, Lobby, Pregunta, Podio).</w:t>
+              <w:t>/</w:t>
+            </w:r>
+            <w:proofErr w:type="spellStart"/>
+            <w:r>
+              <w:rPr>
+                <w:rFonts w:ascii="Calibri" w:eastAsia="Calibri" w:hAnsi="Calibri" w:cs="Calibri"/>
+                <w:color w:val="000000"/>
+                <w:sz w:val="19"/>
+                <w:szCs w:val="19"/>
+              </w:rPr>
+              <w:t>Stitch</w:t>
+            </w:r>
+            <w:proofErr w:type="spellEnd"/>
+            <w:r>
+              <w:rPr>
+                <w:rFonts w:ascii="Calibri" w:eastAsia="Calibri" w:hAnsi="Calibri" w:cs="Calibri"/>
+                <w:color w:val="000000"/>
+                <w:sz w:val="19"/>
+                <w:szCs w:val="19"/>
+              </w:rPr>
+              <w:t>: las 4 vistas (PIN, Lobby, Pregunta, Podio).</w:t>
             </w:r>
           </w:p>
         </w:tc>
@@ -5435,12 +5399,6 @@
         </w:tc>
       </w:tr>
       <w:tr>
-        <w:tblPrEx>
-          <w:tblCellMar>
-            <w:top w:w="0" w:type="dxa"/>
-            <w:bottom w:w="0" w:type="dxa"/>
-          </w:tblCellMar>
-        </w:tblPrEx>
         <w:tc>
           <w:tcPr>
             <w:tcW w:w="450" w:type="dxa"/>
@@ -5558,12 +5516,6 @@
         </w:tc>
       </w:tr>
       <w:tr>
-        <w:tblPrEx>
-          <w:tblCellMar>
-            <w:top w:w="0" w:type="dxa"/>
-            <w:bottom w:w="0" w:type="dxa"/>
-          </w:tblCellMar>
-        </w:tblPrEx>
         <w:tc>
           <w:tcPr>
             <w:tcW w:w="450" w:type="dxa"/>
@@ -5721,12 +5673,6 @@
         </w:tc>
       </w:tr>
       <w:tr>
-        <w:tblPrEx>
-          <w:tblCellMar>
-            <w:top w:w="0" w:type="dxa"/>
-            <w:bottom w:w="0" w:type="dxa"/>
-          </w:tblCellMar>
-        </w:tblPrEx>
         <w:tc>
           <w:tcPr>
             <w:tcW w:w="450" w:type="dxa"/>
@@ -5844,12 +5790,6 @@
         </w:tc>
       </w:tr>
       <w:tr>
-        <w:tblPrEx>
-          <w:tblCellMar>
-            <w:top w:w="0" w:type="dxa"/>
-            <w:bottom w:w="0" w:type="dxa"/>
-          </w:tblCellMar>
-        </w:tblPrEx>
         <w:tc>
           <w:tcPr>
             <w:tcW w:w="450" w:type="dxa"/>
@@ -5999,12 +5939,6 @@
         </w:tc>
       </w:tr>
       <w:tr>
-        <w:tblPrEx>
-          <w:tblCellMar>
-            <w:top w:w="0" w:type="dxa"/>
-            <w:bottom w:w="0" w:type="dxa"/>
-          </w:tblCellMar>
-        </w:tblPrEx>
         <w:tc>
           <w:tcPr>
             <w:tcW w:w="450" w:type="dxa"/>
@@ -6122,12 +6056,6 @@
         </w:tc>
       </w:tr>
       <w:tr>
-        <w:tblPrEx>
-          <w:tblCellMar>
-            <w:top w:w="0" w:type="dxa"/>
-            <w:bottom w:w="0" w:type="dxa"/>
-          </w:tblCellMar>
-        </w:tblPrEx>
         <w:tc>
           <w:tcPr>
             <w:tcW w:w="450" w:type="dxa"/>
@@ -6285,12 +6213,6 @@
         </w:tc>
       </w:tr>
       <w:tr>
-        <w:tblPrEx>
-          <w:tblCellMar>
-            <w:top w:w="0" w:type="dxa"/>
-            <w:bottom w:w="0" w:type="dxa"/>
-          </w:tblCellMar>
-        </w:tblPrEx>
         <w:tc>
           <w:tcPr>
             <w:tcW w:w="450" w:type="dxa"/>
@@ -6333,7 +6255,16 @@
                 <w:sz w:val="19"/>
                 <w:szCs w:val="19"/>
               </w:rPr>
-              <w:t>Agregar a components.html/DESIGN.md los patrones visuales de las 3 mecánicas restantes: Word Blocks, Text Input y Voice, reutilizando la paleta y tipografía ya definidas.</w:t>
+              <w:t xml:space="preserve">Agregar a components.html/DESIGN.md los patrones visuales de las 3 mecánicas restantes: Word Blocks, Text Input y </w:t>
+            </w:r>
+            <w:r>
+              <w:rPr>
+                <w:rFonts w:ascii="Calibri" w:eastAsia="Calibri" w:hAnsi="Calibri" w:cs="Calibri"/>
+                <w:color w:val="000000"/>
+                <w:sz w:val="19"/>
+                <w:szCs w:val="19"/>
+              </w:rPr>
+              <w:t>Voice, reutilizando la paleta y tipografía ya definidas.</w:t>
             </w:r>
           </w:p>
         </w:tc>
@@ -6458,12 +6389,6 @@
         <w:gridCol w:w="1900"/>
       </w:tblGrid>
       <w:tr>
-        <w:tblPrEx>
-          <w:tblCellMar>
-            <w:top w:w="0" w:type="dxa"/>
-            <w:bottom w:w="0" w:type="dxa"/>
-          </w:tblCellMar>
-        </w:tblPrEx>
         <w:trPr>
           <w:tblHeader/>
         </w:trPr>
@@ -6599,12 +6524,6 @@
         </w:tc>
       </w:tr>
       <w:tr>
-        <w:tblPrEx>
-          <w:tblCellMar>
-            <w:top w:w="0" w:type="dxa"/>
-            <w:bottom w:w="0" w:type="dxa"/>
-          </w:tblCellMar>
-        </w:tblPrEx>
         <w:tc>
           <w:tcPr>
             <w:tcW w:w="450" w:type="dxa"/>
@@ -6647,7 +6566,27 @@
                 <w:sz w:val="19"/>
                 <w:szCs w:val="19"/>
               </w:rPr>
-              <w:t xml:space="preserve">Modelo entidad-relación (Room, Player, </w:t>
+              <w:t>Modelo entidad-relación (</w:t>
+            </w:r>
+            <w:proofErr w:type="spellStart"/>
+            <w:r>
+              <w:rPr>
+                <w:rFonts w:ascii="Calibri" w:eastAsia="Calibri" w:hAnsi="Calibri" w:cs="Calibri"/>
+                <w:color w:val="000000"/>
+                <w:sz w:val="19"/>
+                <w:szCs w:val="19"/>
+              </w:rPr>
+              <w:t>Room</w:t>
+            </w:r>
+            <w:proofErr w:type="spellEnd"/>
+            <w:r>
+              <w:rPr>
+                <w:rFonts w:ascii="Calibri" w:eastAsia="Calibri" w:hAnsi="Calibri" w:cs="Calibri"/>
+                <w:color w:val="000000"/>
+                <w:sz w:val="19"/>
+                <w:szCs w:val="19"/>
+              </w:rPr>
+              <w:t xml:space="preserve">, Player, </w:t>
             </w:r>
             <w:proofErr w:type="spellStart"/>
             <w:r>
@@ -6762,12 +6701,6 @@
         </w:tc>
       </w:tr>
       <w:tr>
-        <w:tblPrEx>
-          <w:tblCellMar>
-            <w:top w:w="0" w:type="dxa"/>
-            <w:bottom w:w="0" w:type="dxa"/>
-          </w:tblCellMar>
-        </w:tblPrEx>
         <w:tc>
           <w:tcPr>
             <w:tcW w:w="450" w:type="dxa"/>
@@ -6885,12 +6818,6 @@
         </w:tc>
       </w:tr>
       <w:tr>
-        <w:tblPrEx>
-          <w:tblCellMar>
-            <w:top w:w="0" w:type="dxa"/>
-            <w:bottom w:w="0" w:type="dxa"/>
-          </w:tblCellMar>
-        </w:tblPrEx>
         <w:tc>
           <w:tcPr>
             <w:tcW w:w="450" w:type="dxa"/>
@@ -7048,12 +6975,6 @@
         </w:tc>
       </w:tr>
       <w:tr>
-        <w:tblPrEx>
-          <w:tblCellMar>
-            <w:top w:w="0" w:type="dxa"/>
-            <w:bottom w:w="0" w:type="dxa"/>
-          </w:tblCellMar>
-        </w:tblPrEx>
         <w:tc>
           <w:tcPr>
             <w:tcW w:w="450" w:type="dxa"/>
@@ -7171,12 +7092,6 @@
         </w:tc>
       </w:tr>
       <w:tr>
-        <w:tblPrEx>
-          <w:tblCellMar>
-            <w:top w:w="0" w:type="dxa"/>
-            <w:bottom w:w="0" w:type="dxa"/>
-          </w:tblCellMar>
-        </w:tblPrEx>
         <w:tc>
           <w:tcPr>
             <w:tcW w:w="450" w:type="dxa"/>
@@ -7314,12 +7229,6 @@
         </w:tc>
       </w:tr>
       <w:tr>
-        <w:tblPrEx>
-          <w:tblCellMar>
-            <w:top w:w="0" w:type="dxa"/>
-            <w:bottom w:w="0" w:type="dxa"/>
-          </w:tblCellMar>
-        </w:tblPrEx>
         <w:tc>
           <w:tcPr>
             <w:tcW w:w="450" w:type="dxa"/>
@@ -7437,12 +7346,6 @@
         </w:tc>
       </w:tr>
       <w:tr>
-        <w:tblPrEx>
-          <w:tblCellMar>
-            <w:top w:w="0" w:type="dxa"/>
-            <w:bottom w:w="0" w:type="dxa"/>
-          </w:tblCellMar>
-        </w:tblPrEx>
         <w:tc>
           <w:tcPr>
             <w:tcW w:w="450" w:type="dxa"/>
@@ -7613,7 +7516,17 @@
           <w:sz w:val="30"/>
           <w:szCs w:val="30"/>
         </w:rPr>
-        <w:t>5. QA &amp; Contenido Pedagógico (Inglés)</w:t>
+        <w:t xml:space="preserve">5. QA &amp; Contenido Pedagógico </w:t>
+      </w:r>
+      <w:r>
+        <w:rPr>
+          <w:b/>
+          <w:bCs/>
+          <w:color w:val="1F4E79"/>
+          <w:sz w:val="30"/>
+          <w:szCs w:val="30"/>
+        </w:rPr>
+        <w:t>(Inglés)</w:t>
       </w:r>
     </w:p>
     <w:tbl>
@@ -7641,12 +7554,6 @@
         <w:gridCol w:w="1900"/>
       </w:tblGrid>
       <w:tr>
-        <w:tblPrEx>
-          <w:tblCellMar>
-            <w:top w:w="0" w:type="dxa"/>
-            <w:bottom w:w="0" w:type="dxa"/>
-          </w:tblCellMar>
-        </w:tblPrEx>
         <w:trPr>
           <w:tblHeader/>
         </w:trPr>
@@ -7782,12 +7689,6 @@
         </w:tc>
       </w:tr>
       <w:tr>
-        <w:tblPrEx>
-          <w:tblCellMar>
-            <w:top w:w="0" w:type="dxa"/>
-            <w:bottom w:w="0" w:type="dxa"/>
-          </w:tblCellMar>
-        </w:tblPrEx>
         <w:tc>
           <w:tcPr>
             <w:tcW w:w="450" w:type="dxa"/>
@@ -7905,12 +7806,6 @@
         </w:tc>
       </w:tr>
       <w:tr>
-        <w:tblPrEx>
-          <w:tblCellMar>
-            <w:top w:w="0" w:type="dxa"/>
-            <w:bottom w:w="0" w:type="dxa"/>
-          </w:tblCellMar>
-        </w:tblPrEx>
         <w:tc>
           <w:tcPr>
             <w:tcW w:w="450" w:type="dxa"/>
@@ -8048,12 +7943,6 @@
         </w:tc>
       </w:tr>
       <w:tr>
-        <w:tblPrEx>
-          <w:tblCellMar>
-            <w:top w:w="0" w:type="dxa"/>
-            <w:bottom w:w="0" w:type="dxa"/>
-          </w:tblCellMar>
-        </w:tblPrEx>
         <w:tc>
           <w:tcPr>
             <w:tcW w:w="450" w:type="dxa"/>
@@ -8096,7 +7985,16 @@
                 <w:sz w:val="19"/>
                 <w:szCs w:val="19"/>
               </w:rPr>
-              <w:t>Casos de prueba Módulo 1: Gestión de Salas.</w:t>
+              <w:t xml:space="preserve">Casos de prueba Módulo 1: Gestión de </w:t>
+            </w:r>
+            <w:r>
+              <w:rPr>
+                <w:rFonts w:ascii="Calibri" w:eastAsia="Calibri" w:hAnsi="Calibri" w:cs="Calibri"/>
+                <w:color w:val="000000"/>
+                <w:sz w:val="19"/>
+                <w:szCs w:val="19"/>
+              </w:rPr>
+              <w:t>Salas.</w:t>
             </w:r>
           </w:p>
         </w:tc>
@@ -8182,12 +8080,6 @@
         </w:tc>
       </w:tr>
       <w:tr>
-        <w:tblPrEx>
-          <w:tblCellMar>
-            <w:top w:w="0" w:type="dxa"/>
-            <w:bottom w:w="0" w:type="dxa"/>
-          </w:tblCellMar>
-        </w:tblPrEx>
         <w:tc>
           <w:tcPr>
             <w:tcW w:w="450" w:type="dxa"/>
@@ -8316,12 +8208,6 @@
         </w:tc>
       </w:tr>
       <w:tr>
-        <w:tblPrEx>
-          <w:tblCellMar>
-            <w:top w:w="0" w:type="dxa"/>
-            <w:bottom w:w="0" w:type="dxa"/>
-          </w:tblCellMar>
-        </w:tblPrEx>
         <w:tc>
           <w:tcPr>
             <w:tcW w:w="450" w:type="dxa"/>
@@ -8450,12 +8336,6 @@
         </w:tc>
       </w:tr>
       <w:tr>
-        <w:tblPrEx>
-          <w:tblCellMar>
-            <w:top w:w="0" w:type="dxa"/>
-            <w:bottom w:w="0" w:type="dxa"/>
-          </w:tblCellMar>
-        </w:tblPrEx>
         <w:tc>
           <w:tcPr>
             <w:tcW w:w="450" w:type="dxa"/>
@@ -8498,7 +8378,16 @@
                 <w:sz w:val="19"/>
                 <w:szCs w:val="19"/>
               </w:rPr>
-              <w:t>Pruebas de carga y concurrencia (30-50 dispositivos).</w:t>
+              <w:t xml:space="preserve">Pruebas de carga y </w:t>
+            </w:r>
+            <w:r>
+              <w:rPr>
+                <w:rFonts w:ascii="Calibri" w:eastAsia="Calibri" w:hAnsi="Calibri" w:cs="Calibri"/>
+                <w:color w:val="000000"/>
+                <w:sz w:val="19"/>
+                <w:szCs w:val="19"/>
+              </w:rPr>
+              <w:t>concurrencia (30-50 dispositivos).</w:t>
             </w:r>
           </w:p>
         </w:tc>
@@ -8584,12 +8473,6 @@
         </w:tc>
       </w:tr>
       <w:tr>
-        <w:tblPrEx>
-          <w:tblCellMar>
-            <w:top w:w="0" w:type="dxa"/>
-            <w:bottom w:w="0" w:type="dxa"/>
-          </w:tblCellMar>
-        </w:tblPrEx>
         <w:tc>
           <w:tcPr>
             <w:tcW w:w="450" w:type="dxa"/>
@@ -8727,12 +8610,6 @@
         </w:tc>
       </w:tr>
       <w:tr>
-        <w:tblPrEx>
-          <w:tblCellMar>
-            <w:top w:w="0" w:type="dxa"/>
-            <w:bottom w:w="0" w:type="dxa"/>
-          </w:tblCellMar>
-        </w:tblPrEx>
         <w:tc>
           <w:tcPr>
             <w:tcW w:w="450" w:type="dxa"/>
@@ -8869,7 +8746,17 @@
           <w:szCs w:val="30"/>
         </w:rPr>
         <w:lastRenderedPageBreak/>
-        <w:t>6. Mapa de dependencias entre equipos</w:t>
+        <w:t xml:space="preserve">6. </w:t>
+      </w:r>
+      <w:r>
+        <w:rPr>
+          <w:b/>
+          <w:bCs/>
+          <w:color w:val="1F4E79"/>
+          <w:sz w:val="30"/>
+          <w:szCs w:val="30"/>
+        </w:rPr>
+        <w:t>Mapa de dependencias entre equipos</w:t>
       </w:r>
     </w:p>
     <w:p>
@@ -9072,7 +8959,15 @@
           <w:sz w:val="22"/>
           <w:szCs w:val="22"/>
         </w:rPr>
-        <w:t xml:space="preserve"> no puede probar el registro de jugador.</w:t>
+        <w:t xml:space="preserve"> no puede probar el </w:t>
+      </w:r>
+      <w:r>
+        <w:rPr>
+          <w:rFonts w:ascii="Calibri" w:eastAsia="Calibri" w:hAnsi="Calibri" w:cs="Calibri"/>
+          <w:sz w:val="22"/>
+          <w:szCs w:val="22"/>
+        </w:rPr>
+        <w:t>registro de jugador.</w:t>
       </w:r>
     </w:p>
     <w:p>
@@ -9208,7 +9103,15 @@
           <w:sz w:val="22"/>
           <w:szCs w:val="22"/>
         </w:rPr>
-        <w:t xml:space="preserve">El Hito H2 (Core de Comunicación Estable, fin de semana 3) es el punto en el que </w:t>
+        <w:t>El Hito H2 (Core de Comuni</w:t>
+      </w:r>
+      <w:r>
+        <w:rPr>
+          <w:rFonts w:ascii="Calibri" w:eastAsia="Calibri" w:hAnsi="Calibri" w:cs="Calibri"/>
+          <w:sz w:val="22"/>
+          <w:szCs w:val="22"/>
+        </w:rPr>
+        <w:t xml:space="preserve">cación Estable, fin de semana 3) es el punto en el que </w:t>
       </w:r>
       <w:proofErr w:type="spellStart"/>
       <w:r>
@@ -9272,7 +9175,15 @@
           <w:sz w:val="22"/>
           <w:szCs w:val="22"/>
         </w:rPr>
-        <w:t xml:space="preserve"> (tarea 14, Panel de Moderador) puede empezar en paralelo con las tareas 5-8 — no depende de ellas, solo de </w:t>
+        <w:t xml:space="preserve"> (tarea 14, Panel de Moderador) puede empezar en paralelo con las tareas 5-8 — no depen</w:t>
+      </w:r>
+      <w:r>
+        <w:rPr>
+          <w:rFonts w:ascii="Calibri" w:eastAsia="Calibri" w:hAnsi="Calibri" w:cs="Calibri"/>
+          <w:sz w:val="22"/>
+          <w:szCs w:val="22"/>
+        </w:rPr>
+        <w:t xml:space="preserve">de de ellas, solo de </w:t>
       </w:r>
       <w:proofErr w:type="spellStart"/>
       <w:r>
@@ -9326,7 +9237,15 @@
           <w:sz w:val="22"/>
           <w:szCs w:val="22"/>
         </w:rPr>
-        <w:t xml:space="preserve"> empiece sus tareas 6, 7 y 8 (Word Blocks, Text Input, Voice) — sin ese patrón visual, </w:t>
+        <w:t xml:space="preserve"> empiece sus tareas 6, 7 y </w:t>
+      </w:r>
+      <w:r>
+        <w:rPr>
+          <w:rFonts w:ascii="Calibri" w:eastAsia="Calibri" w:hAnsi="Calibri" w:cs="Calibri"/>
+          <w:sz w:val="22"/>
+          <w:szCs w:val="22"/>
+        </w:rPr>
+        <w:t xml:space="preserve">8 (Word Blocks, Text Input, Voice) — sin ese patrón visual, </w:t>
       </w:r>
       <w:proofErr w:type="spellStart"/>
       <w:r>
@@ -9358,7 +9277,7 @@
 </file>
 
 <file path=word/numbering.xml><?xml version="1.0" encoding="utf-8"?>
-<w:numbering xmlns:wpc="http://schemas.microsoft.com/office/word/2010/wordprocessingCanvas" xmlns:cx="http://schemas.microsoft.com/office/drawing/2014/chartex" xmlns:cx1="http://schemas.microsoft.com/office/drawing/2015/9/8/chartex" xmlns:cx2="http://schemas.microsoft.com/office/drawing/2015/10/21/chartex" xmlns:cx3="http://schemas.microsoft.com/office/drawing/2016/5/9/chartex" xmlns:cx4="http://schemas.microsoft.com/office/drawing/2016/5/10/chartex" xmlns:cx5="http://schemas.microsoft.com/office/drawing/2016/5/11/chartex" xmlns:cx6="http://schemas.microsoft.com/office/drawing/2016/5/12/chartex" xmlns:cx7="http://schemas.microsoft.com/office/drawing/2016/5/13/chartex" xmlns:cx8="http://schemas.microsoft.com/office/drawing/2016/5/14/chartex" xmlns:mc="http://schemas.openxmlformats.org/markup-compatibility/2006" xmlns:m="http://schemas.openxmlformats.org/officeDocument/2006/math" xmlns:aink="http://schemas.microsoft.com/office/drawing/2016/ink" xmlns:am3d="http://schemas.microsoft.com/office/drawing/2017/model3d" xmlns:oel="http://schemas.microsoft.com/office/2019/extlst" xmlns:r="http://schemas.openxmlformats.org/officeDocument/2006/relationships" xmlns:wp14="http://schemas.microsoft.com/office/word/2010/wordprocessingDrawing" xmlns:wp="http://schemas.openxmlformats.org/drawingml/2006/wordprocessingDrawing" xmlns:wpg="http://schemas.microsoft.com/office/word/2010/wordprocessingGroup" xmlns:wpi="http://schemas.microsoft.com/office/word/2010/wordprocessingInk" xmlns:wps="http://schemas.microsoft.com/office/word/2010/wordprocessingShape" xmlns:o="urn:schemas-microsoft-com:office:office" xmlns:v="urn:schemas-microsoft-com:vml" xmlns:w10="urn:schemas-microsoft-com:office:word" xmlns:w="http://schemas.openxmlformats.org/wordprocessingml/2006/main" xmlns:w14="http://schemas.microsoft.com/office/word/2010/wordml" xmlns:w15="http://schemas.microsoft.com/office/word/2012/wordml" xmlns:w16cex="http://schemas.microsoft.com/office/word/2018/wordml/cex" xmlns:w16cid="http://schemas.microsoft.com/office/word/2016/wordml/cid" xmlns:w16="http://schemas.microsoft.com/office/word/2018/wordml" xmlns:w16sdtdh="http://schemas.microsoft.com/office/word/2020/wordml/sdtdatahash" xmlns:w16sdtfl="http://schemas.microsoft.com/office/word/2024/wordml/sdtformatlock" xmlns:w16se="http://schemas.microsoft.com/office/word/2015/wordml/symex" xmlns:w16du="http://schemas.microsoft.com/office/word/2023/wordml/word16du" xmlns:wne="http://schemas.microsoft.com/office/word/2006/wordml" mc:Ignorable="w14 w15 w16se w16cid w16 w16cex w16sdtdh w16sdtfl w16du wp14">
+<w:numbering xmlns:wpc="http://schemas.microsoft.com/office/word/2010/wordprocessingCanvas" xmlns:cx="http://schemas.microsoft.com/office/drawing/2014/chartex" xmlns:cx1="http://schemas.microsoft.com/office/drawing/2015/9/8/chartex" xmlns:cx2="http://schemas.microsoft.com/office/drawing/2015/10/21/chartex" xmlns:cx3="http://schemas.microsoft.com/office/drawing/2016/5/9/chartex" xmlns:cx4="http://schemas.microsoft.com/office/drawing/2016/5/10/chartex" xmlns:cx5="http://schemas.microsoft.com/office/drawing/2016/5/11/chartex" xmlns:cx6="http://schemas.microsoft.com/office/drawing/2016/5/12/chartex" xmlns:cx7="http://schemas.microsoft.com/office/drawing/2016/5/13/chartex" xmlns:cx8="http://schemas.microsoft.com/office/drawing/2016/5/14/chartex" xmlns:mc="http://schemas.openxmlformats.org/markup-compatibility/2006" xmlns:aink="http://schemas.microsoft.com/office/drawing/2016/ink" xmlns:am3d="http://schemas.microsoft.com/office/drawing/2017/model3d" xmlns:o="urn:schemas-microsoft-com:office:office" xmlns:r="http://schemas.openxmlformats.org/officeDocument/2006/relationships" xmlns:m="http://schemas.openxmlformats.org/officeDocument/2006/math" xmlns:v="urn:schemas-microsoft-com:vml" xmlns:wp14="http://schemas.microsoft.com/office/word/2010/wordprocessingDrawing" xmlns:wp="http://schemas.openxmlformats.org/drawingml/2006/wordprocessingDrawing" xmlns:w10="urn:schemas-microsoft-com:office:word" xmlns:w="http://schemas.openxmlformats.org/wordprocessingml/2006/main" xmlns:w14="http://schemas.microsoft.com/office/word/2010/wordml" xmlns:w15="http://schemas.microsoft.com/office/word/2012/wordml" xmlns:w16cex="http://schemas.microsoft.com/office/word/2018/wordml/cex" xmlns:w16cid="http://schemas.microsoft.com/office/word/2016/wordml/cid" xmlns:w16="http://schemas.microsoft.com/office/word/2018/wordml" xmlns:w16sdtdh="http://schemas.microsoft.com/office/word/2020/wordml/sdtdatahash" xmlns:w16se="http://schemas.microsoft.com/office/word/2015/wordml/symex" xmlns:wpg="http://schemas.microsoft.com/office/word/2010/wordprocessingGroup" xmlns:wpi="http://schemas.microsoft.com/office/word/2010/wordprocessingInk" xmlns:wne="http://schemas.microsoft.com/office/word/2006/wordml" xmlns:wps="http://schemas.microsoft.com/office/word/2010/wordprocessingShape" mc:Ignorable="w14 w15 w16se w16cid w16 w16cex w16sdtdh wp14">
   <w:abstractNum w:abstractNumId="0" w15:restartNumberingAfterBreak="0">
     <w:nsid w:val="45300FE1"/>
     <w:multiLevelType w:val="hybridMultilevel"/>
@@ -9496,13 +9415,13 @@
       </w:pPr>
     </w:lvl>
   </w:abstractNum>
-  <w:num w:numId="1" w16cid:durableId="1835679171">
+  <w:num w:numId="1">
     <w:abstractNumId w:val="1"/>
     <w:lvlOverride w:ilvl="0">
       <w:startOverride w:val="1"/>
     </w:lvlOverride>
   </w:num>
-  <w:num w:numId="2" w16cid:durableId="1209344791">
+  <w:num w:numId="2">
     <w:abstractNumId w:val="0"/>
     <w:lvlOverride w:ilvl="0">
       <w:startOverride w:val="1"/>
@@ -9512,7 +9431,7 @@
 </file>
 
 <file path=word/styles.xml><?xml version="1.0" encoding="utf-8"?>
-<w:styles xmlns:mc="http://schemas.openxmlformats.org/markup-compatibility/2006" xmlns:r="http://schemas.openxmlformats.org/officeDocument/2006/relationships" xmlns:w="http://schemas.openxmlformats.org/wordprocessingml/2006/main" xmlns:w14="http://schemas.microsoft.com/office/word/2010/wordml" xmlns:w15="http://schemas.microsoft.com/office/word/2012/wordml" xmlns:w16cex="http://schemas.microsoft.com/office/word/2018/wordml/cex" xmlns:w16cid="http://schemas.microsoft.com/office/word/2016/wordml/cid" xmlns:w16="http://schemas.microsoft.com/office/word/2018/wordml" xmlns:w16sdtdh="http://schemas.microsoft.com/office/word/2020/wordml/sdtdatahash" xmlns:w16sdtfl="http://schemas.microsoft.com/office/word/2024/wordml/sdtformatlock" xmlns:w16se="http://schemas.microsoft.com/office/word/2015/wordml/symex" xmlns:w16du="http://schemas.microsoft.com/office/word/2023/wordml/word16du" mc:Ignorable="w14 w15 w16se w16cid w16 w16cex w16sdtdh w16sdtfl w16du">
+<w:styles xmlns:mc="http://schemas.openxmlformats.org/markup-compatibility/2006" xmlns:r="http://schemas.openxmlformats.org/officeDocument/2006/relationships" xmlns:w="http://schemas.openxmlformats.org/wordprocessingml/2006/main" xmlns:w14="http://schemas.microsoft.com/office/word/2010/wordml" xmlns:w15="http://schemas.microsoft.com/office/word/2012/wordml" xmlns:w16cex="http://schemas.microsoft.com/office/word/2018/wordml/cex" xmlns:w16cid="http://schemas.microsoft.com/office/word/2016/wordml/cid" xmlns:w16="http://schemas.microsoft.com/office/word/2018/wordml" xmlns:w16sdtdh="http://schemas.microsoft.com/office/word/2020/wordml/sdtdatahash" xmlns:w16se="http://schemas.microsoft.com/office/word/2015/wordml/symex" mc:Ignorable="w14 w15 w16se w16cid w16 w16cex w16sdtdh">
   <w:docDefaults>
     <w:rPrDefault>
       <w:rPr>

</xml_diff>